<commit_message>
Claudinho: gancho com segredo sombrio
Co-Authored-By: Claude Opus 5.5 <noreply@anthropic.com>
Claude-Session: https://claude.ai/code/session_01MJjUEEZrxQDEUifKK2vj9g
</commit_message>
<xml_diff>
--- a/roteiros/claudinho/Claudinho_Parte1.docx
+++ b/roteiros/claudinho/Claudinho_Parte1.docx
@@ -15,7 +15,7 @@
         <w:rPr>
           <w:color w:val="C00000"/>
         </w:rPr>
-        <w:t>Claudinho morreu às seis e quarenta da manhã de treze de julho de dois mil e dois. E, poucas horas antes, ele tinha avisado que não queria ir àquele show.</w:t>
+        <w:t>Claudinho passou as últimas horas da vida agindo como se soubesse que algo terrível ia acontecer. E, na madrugada em que morreu, fez uma escolha arrepiante que até hoje ninguém consegue explicar.</w:t>
       </w:r>
     </w:p>
     <w:p>
@@ -23,7 +23,7 @@
         <w:rPr>
           <w:color w:val="C00000"/>
         </w:rPr>
-        <w:t>O que pouca gente sabe é que, naquela madrugada, ele fez questão de voltar num carro separado do parceiro. E o que aconteceu dentro daquele carro terminou com um homem sendo chamado de assassino no velório dele.</w:t>
+        <w:t>O que pouca gente sabe é que, naquela noite, ele se recusou a viajar ao lado do melhor amigo. E o homem que estava com ele no carro acabou sendo chamado de assassino diante do caixão.</w:t>
       </w:r>
     </w:p>
     <w:p>
@@ -31,7 +31,7 @@
         <w:rPr>
           <w:color w:val="C00000"/>
         </w:rPr>
-        <w:t>Fique até o final, porque você vai descobrir o que realmente aconteceu naquela madrugada. E quem a Justiça apontou como culpado.</w:t>
+        <w:t>Fique até o final, porque você vai descobrir o segredo sombrio por trás daquela estrada. E quem a Justiça, anos depois, apontou como o verdadeiro culpado.</w:t>
       </w:r>
     </w:p>
     <w:p>
@@ -39,7 +39,7 @@
         <w:rPr>
           <w:color w:val="000000"/>
         </w:rPr>
-        <w:t>Para entender por que um homem que tinha tudo não queria subir num palco naquela noite, é preciso voltar muito antes. Para as ruas da periferia de São Gonçalo, na região metropolitana do Rio de Janeiro.</w:t>
+        <w:t>Para entender por que um homem que tinha tudo parecia pressentir o próprio fim, é preciso voltar muito antes. Para as ruas da periferia de São Gonçalo, na região metropolitana do Rio de Janeiro.</w:t>
       </w:r>
     </w:p>
     <w:p>

</xml_diff>

<commit_message>
Claudinho: ajuste do gancho
Co-Authored-By: Claude Opus 5.5 <noreply@anthropic.com>
Claude-Session: https://claude.ai/code/session_01MJjUEEZrxQDEUifKK2vj9g
</commit_message>
<xml_diff>
--- a/roteiros/claudinho/Claudinho_Parte1.docx
+++ b/roteiros/claudinho/Claudinho_Parte1.docx
@@ -23,7 +23,7 @@
         <w:rPr>
           <w:color w:val="C00000"/>
         </w:rPr>
-        <w:t>O que pouca gente sabe é que, naquela noite, ele se recusou a viajar ao lado do melhor amigo. E foi justamente esse amigo, vindo logo atrás, quem chegou antes da ambulância e encontrou Claudinho já sem vida.</w:t>
+        <w:t>O que pouca gente sabe é que, naquela noite, ele se recusou a viajar ao lado do melhor amigo. E levou para o túmulo o motivo dessa decisão.</w:t>
       </w:r>
     </w:p>
     <w:p>
@@ -31,7 +31,7 @@
         <w:rPr>
           <w:color w:val="C00000"/>
         </w:rPr>
-        <w:t>Fique até o final, porque você vai descobrir o segredo sombrio por trás daquela estrada. E quem a Justiça, anos depois, apontou como o verdadeiro culpado.</w:t>
+        <w:t>Fique até o final, porque você vai descobrir o segredo sombrio por trás da morte dele. E quem a Justiça, anos depois, apontou como o verdadeiro culpado.</w:t>
       </w:r>
     </w:p>
     <w:p>

</xml_diff>

<commit_message>
Claudinho: revisão da Parte 1
Co-Authored-By: Claude Opus 5.5 <noreply@anthropic.com>
Claude-Session: https://claude.ai/code/session_01MJjUEEZrxQDEUifKK2vj9g
</commit_message>
<xml_diff>
--- a/roteiros/claudinho/Claudinho_Parte1.docx
+++ b/roteiros/claudinho/Claudinho_Parte1.docx
@@ -119,7 +119,7 @@
         <w:rPr>
           <w:color w:val="C00000"/>
         </w:rPr>
-        <w:t>Esse outro menino ia ficar ao lado de Claudinho pelos próximos vinte anos. E, naquela madrugada de dois mil e dois, ia estar a poucos metros dele. Perto o bastante para ver tudo. Longe demais para fazer qualquer coisa.</w:t>
+        <w:t>Esse outro menino ia ficar ao lado de Claudinho pelos próximos vinte anos. E, naquela madrugada de dois mil e dois, ia estar logo atrás dele na estrada. Perto o bastante para chegar primeiro. Longe demais para fazer qualquer coisa.</w:t>
       </w:r>
     </w:p>
     <w:p>
@@ -151,7 +151,7 @@
         <w:rPr>
           <w:color w:val="000000"/>
         </w:rPr>
-        <w:t>Almoçavam um na casa do outro. E, desde os onze anos, trabalhavam juntos nas mesmas obras.</w:t>
+        <w:t>Almoçavam um na casa do outro. E, desde os onze anos, os dois já trabalhavam em obras.</w:t>
       </w:r>
     </w:p>
     <w:p>
@@ -271,7 +271,7 @@
         <w:rPr>
           <w:color w:val="000000"/>
         </w:rPr>
-        <w:t>Claudinho insistiu. Insistiu de novo. Queria que os dois formassem uma dupla. Buchecha resistiu, porque já tinha o pagode, já tinha o grupo dele.</w:t>
+        <w:t>Claudinho insistiu. Insistiu de novo. Queria que os dois formassem uma dupla. Buchecha resistiu. Ainda cantava pagode com o grupo dele.</w:t>
       </w:r>
     </w:p>
     <w:p>
@@ -287,7 +287,7 @@
         <w:rPr>
           <w:color w:val="000000"/>
         </w:rPr>
-        <w:t>Os dois começaram a escrever juntos, no morro, nos intervalos do trabalho.</w:t>
+        <w:t>Os dois começaram a escrever juntos, ali mesmo, no morro.</w:t>
       </w:r>
     </w:p>
     <w:p>
@@ -343,7 +343,7 @@
         <w:rPr>
           <w:color w:val="C00000"/>
         </w:rPr>
-        <w:t>E, daqui a pouco, você vai ver que um carro ia virar o centro desta história. O carro do próprio Claudinho, um Golf. Lembre dessa placa, porque ela vai voltar. L, A, Z, quatro, seis, seis, cinco.</w:t>
+        <w:t>Mais adiante, você vai ver que um carro ia virar o centro desta história. O carro do próprio Claudinho, um Golf. Lembre dessa placa, porque ela vai voltar. L, A, Z, quatro, seis, seis, cinco.</w:t>
       </w:r>
     </w:p>
     <w:p>
@@ -383,7 +383,7 @@
         <w:rPr>
           <w:color w:val="000000"/>
         </w:rPr>
-        <w:t>Dessa vez, o público inteiro cantou junto.</w:t>
+        <w:t>Dessa vez, a música pegou.</w:t>
       </w:r>
     </w:p>
     <w:p>

</xml_diff>